<commit_message>
docs(article): regenerate the PDF and Word of the three article versions
</commit_message>
<xml_diff>
--- a/10_ARTICULO_DEL_PROYECTO/WORD/10_Articulo_Del_Proyecto_ACM.docx
+++ b/10_ARTICULO_DEL_PROYECTO/WORD/10_Articulo_Del_Proyecto_ACM.docx
@@ -88,7 +88,7 @@
         <w:t xml:space="preserve"> </w:t>
       </w:r>
       <w:r>
-        <w:t xml:space="preserve">Este artículo describe el diseño, la implementación y la verificación de Vehicle Washing (LavaRapido), una plataforma web y Android para un lavadero vehicular de una sola sede, desarrollada como proyecto formativo del SENA. El problema documentado es que las reservas por llamada, los registros a mano, la asignación discrecional del trabajo y los pagos en efectivo sin registro no dejan trazabilidad sobre turnos, servicios ni pagos. El trabajo siguió un enfoque de documentación de diseño de software (SDD) con siete sprints inspirados en Scrum, y su alcance evolucionó desde un servicio móvil por zonas con pasarela de pagos hacia un lavadero de sede única con pagos por QR o transferencia con comprobante revisado por el administrador, o en efectivo. La solución integra seis microservicios (cinco en Java 21 con Spring Boot 4 y uno en .NET 8) detrás de un API Gateway, SQL Server 2022 con 57 tablas, RabbitMQ y clientes en Angular 21 y React Native. Al 16 de octubre de 2026, 40 de los 41 requisitos funcionales estaban implementados y 1 era parcial. Ese día se ejecutaron 639 pruebas automatizadas, todas aprobadas (7 de persistencia quedaron omitidas porque necesitan una base de pruebas dedicada), y 19 pruebas de punta a punta contra el sistema completo en Docker, también aprobadas. El sistema corre además en un servidor público en Azure. Quedan pendientes la integración continua, los reportes consolidados y un límite de solicitudes en el gateway. Los beneficios operativos siguen siendo una hipótesis, porque no se han medido con personas usuarias reales.</w:t>
+        <w:t xml:space="preserve">Este artículo describe el diseño, la implementación y la verificación de Vehicle Washing (LavaRapido), una plataforma web y Android para un lavadero vehicular de una sola sede, desarrollada como proyecto formativo del SENA. El problema documentado es que las reservas por llamada, los registros a mano, la asignación discrecional del trabajo y los pagos en efectivo sin registro no dejan trazabilidad sobre turnos, servicios ni pagos. El trabajo siguió un enfoque de documentación de diseño de software (SDD) con siete sprints inspirados en Scrum, y su alcance evolucionó desde un servicio móvil por zonas con pasarela de pagos hacia un lavadero de sede única con pagos por QR o transferencia con comprobante revisado por el administrador, o en efectivo. La solución integra seis microservicios (cinco en Java 21 con Spring Boot 4 y uno en .NET 8) detrás de un API Gateway, SQL Server 2022 con 57 tablas, RabbitMQ y clientes en Angular 21 y React Native. Al 16 de octubre de 2026, 40 de los 41 requisitos funcionales estaban implementados y 1 era parcial. Ese día se ejecutaron 639 pruebas automatizadas, todas aprobadas (7 de persistencia quedaron omitidas porque necesitan una base de pruebas dedicada), y 19 pruebas de punta a punta contra el sistema completo en Docker, también aprobadas. El sistema corre además en un servidor público en Azure. Desde el 19 de octubre de 2026, cada repositorio compila y corre sus pruebas con GitHub Actions en cada cambio. Quedan pendientes los reportes consolidados y un límite de solicitudes en el gateway. Los beneficios operativos siguen siendo una hipótesis, porque no se han medido con personas usuarias reales.</w:t>
       </w:r>
     </w:p>
     <w:p>
@@ -1123,7 +1123,7 @@
         <w:t xml:space="preserve"> </w:t>
       </w:r>
       <w:r>
-        <w:t xml:space="preserve">Elaborado a partir del manual técnico [Patiño Cabrera et al. 2026b]. La integración continua con Jenkins está planeada, pero no configurada.</w:t>
+        <w:t xml:space="preserve">Elaborado a partir del manual técnico [Patiño Cabrera et al. 2026b]. La integración continua se hace con GitHub Actions en los 10 repositorios.</w:t>
       </w:r>
     </w:p>
     <w:bookmarkEnd w:id="35"/>
@@ -3961,7 +3961,7 @@
         <w:pStyle w:val="BodyText"/>
       </w:pPr>
       <w:r>
-        <w:t xml:space="preserve">La aplicación de la arquitectura hexagonal [Cockburn 2005] se refleja en la forma de las pruebas: las 639 pruebas automatizadas se ejecutan sin base de datos, porque prueban el dominio, los casos de uso y la capa web con dobles de prueba en lugar de la infraestructura real, lo que las hace rápidas y deterministas. Sin embargo, la ausencia de medición de cobertura y de integración continua limita la confianza que estas cifras pueden dar; la suite de punta a punta lo compensa en parte, porque prueba los servicios integrados. La investigación de Forsgren et al. [2018] asocia la integración continua y la automatización de pruebas con un mejor desempeño en la entrega de software, y el propio proyecto identifica la canalización de Jenkins como deuda técnica (TD-006).</w:t>
+        <w:t xml:space="preserve">La aplicación de la arquitectura hexagonal [Cockburn 2005] se refleja en la forma de las pruebas: las 639 pruebas automatizadas se ejecutan sin base de datos, porque prueban el dominio, los casos de uso y la capa web con dobles de prueba en lugar de la infraestructura real, lo que las hace rápidas y deterministas. Desde el 19 de octubre de 2026 esas pruebas corren solas en cada cambio con GitHub Actions; sin embargo, la ausencia de medición de cobertura limita la confianza que estas cifras pueden dar, y la suite de punta a punta, que prueba los servicios integrados, todavía se corre a mano. La investigación de Forsgren et al. [2018] asocia la integración continua y la automatización de pruebas con un mejor desempeño en la entrega de software; por eso el proyecto cerró su deuda técnica TD-006 con GitHub Actions.</w:t>
       </w:r>
     </w:p>
     <w:p>
@@ -4021,15 +4021,15 @@
         <w:pStyle w:val="BodyText"/>
       </w:pPr>
       <w:r>
-        <w:t xml:space="preserve">Al mismo tiempo, falta lo más importante para operar con personas usuarias reales: la validación con el negocio. También faltan la integración continua y un límite de solicitudes en el gateway. Por tanto, los beneficios operativos planteados en el problema siguen siendo una hipótesis que este trabajo no confirma ni refuta.</w:t>
-      </w:r>
-    </w:p>
-    <w:p>
-      <w:pPr>
-        <w:pStyle w:val="BodyText"/>
-      </w:pPr>
-      <w:r>
-        <w:t xml:space="preserve">Como trabajo futuro, la propia documentación propone: ejecutar los casos de aceptación y un piloto controlado que establezca la línea base de las medidas de éxito; configurar la canalización de Jenkins; agregar pruebas de persistencia con SQL Server real y medición de cobertura; completar los reportes consolidados por periodo; agregar un límite de solicitudes en el gateway; y, si el proyecto sale del ámbito académico, adoptar firma RS256, tokens de actualización, Outbox, auditoría poblada y una base de datos o un inicio de sesión de base de datos por servicio [Patiño Cabrera et al. 2026b].</w:t>
+        <w:t xml:space="preserve">Al mismo tiempo, falta lo más importante para operar con personas usuarias reales: la validación con el negocio. También falta un límite de solicitudes en el gateway. Por tanto, los beneficios operativos planteados en el problema siguen siendo una hipótesis que este trabajo no confirma ni refuta.</w:t>
+      </w:r>
+    </w:p>
+    <w:p>
+      <w:pPr>
+        <w:pStyle w:val="BodyText"/>
+      </w:pPr>
+      <w:r>
+        <w:t xml:space="preserve">Como trabajo futuro, la propia documentación propone: ejecutar los casos de aceptación y un piloto controlado que establezca la línea base de las medidas de éxito; llevar a la integración continua las pruebas de punta a punta; agregar pruebas de persistencia con SQL Server real y medición de cobertura; completar los reportes consolidados por periodo; agregar un límite de solicitudes en el gateway; y, si el proyecto sale del ámbito académico, adoptar firma RS256, tokens de actualización, Outbox, auditoría poblada y una base de datos o un inicio de sesión de base de datos por servicio [Patiño Cabrera et al. 2026b].</w:t>
       </w:r>
     </w:p>
     <w:bookmarkEnd w:id="55"/>
@@ -5195,7 +5195,7 @@
         <w:t xml:space="preserve"> </w:t>
       </w:r>
       <w:r>
-        <w:t xml:space="preserve">This article describes the design, implementation, and verification of Vehicle Washing (LavaRapido), a web and Android platform for a single-location car wash, developed as a training project in SENA's Technologist in Software Analysis and Development program. The documented problem is that bookings made by phone or in person, handwritten records, discretionary work assignment, and unrecorded cash payments leave no traceability over time slots, service execution, or payments. The work followed a software design documentation (SDD) approach with seven Scrum-inspired sprints. The scope evolved from a mobile, zone-based service with a payment gateway to a single-location car wash with payments by QR or transfer with a receipt reviewed by the administrator, or in cash. The solution consists of six domain microservices (five in Java 21 with Spring Boot 4 and one in .NET 8) behind an API gateway, a SQL Server 2022 database with nine schemas and 57 tables, RabbitMQ messaging, and Angular 21 and React Native clients. As of October 16, 2026, 40 of the 41 functional requirements were implemented and 1 was partial. That day 639 automated tests were run and all passed (7 persistence tests were skipped because they need a dedicated test database), and 19 end-to-end tests against the complete system in Docker also passed. The system also runs on a public server on Azure. Continuous integration, the consolidated reports, and a request rate limit in the gateway are still pending. The operational benefits for the business remain a hypothesis, because they have not yet been measured with real users.</w:t>
+        <w:t xml:space="preserve">This article describes the design, implementation, and verification of Vehicle Washing (LavaRapido), a web and Android platform for a single-location car wash, developed as a training project in SENA's Technologist in Software Analysis and Development program. The documented problem is that bookings made by phone or in person, handwritten records, discretionary work assignment, and unrecorded cash payments leave no traceability over time slots, service execution, or payments. The work followed a software design documentation (SDD) approach with seven Scrum-inspired sprints. The scope evolved from a mobile, zone-based service with a payment gateway to a single-location car wash with payments by QR or transfer with a receipt reviewed by the administrator, or in cash. The solution consists of six domain microservices (five in Java 21 with Spring Boot 4 and one in .NET 8) behind an API gateway, a SQL Server 2022 database with nine schemas and 57 tables, RabbitMQ messaging, and Angular 21 and React Native clients. As of October 16, 2026, 40 of the 41 functional requirements were implemented and 1 was partial. That day 639 automated tests were run and all passed (7 persistence tests were skipped because they need a dedicated test database), and 19 end-to-end tests against the complete system in Docker also passed. The system also runs on a public server on Azure. Since October 19, 2026, each repository builds and runs its tests with GitHub Actions on every change. The consolidated reports and a request rate limit in the gateway are still pending. The operational benefits for the business remain a hypothesis, because they have not yet been measured with real users.</w:t>
       </w:r>
     </w:p>
     <w:p>
@@ -6153,7 +6153,7 @@
         <w:t xml:space="preserve"> </w:t>
       </w:r>
       <w:r>
-        <w:t xml:space="preserve">Based on the technical manual [Patiño Cabrera et al. 2026c]. Continuous integration with Jenkins is planned but not configured.</w:t>
+        <w:t xml:space="preserve">Based on the technical manual [Patiño Cabrera et al. 2026c]. Continuous integration runs on GitHub Actions in the 10 repositories.</w:t>
       </w:r>
     </w:p>
     <w:bookmarkEnd w:id="90"/>
@@ -8982,7 +8982,7 @@
         <w:pStyle w:val="BodyText"/>
       </w:pPr>
       <w:r>
-        <w:t xml:space="preserve">The application of hexagonal architecture [Cockburn 2005] is reflected in the shape of the tests: all 639 automated tests run without a database, because they test the domain, the use cases, and the web layer with test doubles instead of the real infrastructure, which makes them fast and deterministic. However, the lack of coverage measurement and continuous integration limits the confidence these figures can provide; the end-to-end suite partly compensates, because it tests the integrated services. Research by Forsgren et al. [2018] associates continuous integration and test automation with better software delivery performance, and the project itself identifies the Jenkins pipeline as technical debt (TD-006).</w:t>
+        <w:t xml:space="preserve">The application of hexagonal architecture [Cockburn 2005] is reflected in the shape of the tests: all 639 automated tests run without a database, because they test the domain, the use cases, and the web layer with test doubles instead of the real infrastructure, which makes them fast and deterministic. Since October 19, 2026, these tests run automatically on every change with GitHub Actions; however, the lack of coverage measurement limits the confidence these figures can provide, and the end-to-end suite, which tests the integrated services, is still run by hand. Research by Forsgren et al. [2018] associates continuous integration and test automation with better software delivery performance, which is why the project closed its technical debt TD-006 with GitHub Actions.</w:t>
       </w:r>
     </w:p>
     <w:p>
@@ -9042,15 +9042,15 @@
         <w:pStyle w:val="BodyText"/>
       </w:pPr>
       <w:r>
-        <w:t xml:space="preserve">At the same time, the most important step to operate with real users is still missing: validation with the business. Continuous integration and a request rate limit in the gateway are also missing. Therefore, the operational benefits stated in the problem remain a hypothesis that this work neither confirms nor refutes.</w:t>
-      </w:r>
-    </w:p>
-    <w:p>
-      <w:pPr>
-        <w:pStyle w:val="BodyText"/>
-      </w:pPr>
-      <w:r>
-        <w:t xml:space="preserve">As future work, the documentation itself proposes: running the acceptance cases and a controlled pilot to establish the baseline for the success measures; configuring the Jenkins pipeline; adding persistence tests against a real SQL Server and coverage measurement; completing the consolidated reports per period; adding a request rate limit in the gateway; and, if the project moves beyond the academic setting, adopting RS256 signing, refresh tokens, Outbox, populated auditing, and a database or database login per service [Patiño Cabrera et al. 2026c].</w:t>
+        <w:t xml:space="preserve">At the same time, the most important step to operate with real users is still missing: validation with the business. A request rate limit in the gateway is also missing. Therefore, the operational benefits stated in the problem remain a hypothesis that this work neither confirms nor refutes.</w:t>
+      </w:r>
+    </w:p>
+    <w:p>
+      <w:pPr>
+        <w:pStyle w:val="BodyText"/>
+      </w:pPr>
+      <w:r>
+        <w:t xml:space="preserve">As future work, the documentation itself proposes: running the acceptance cases and a controlled pilot to establish the baseline for the success measures; bringing the end-to-end tests into continuous integration; adding persistence tests against a real SQL Server and coverage measurement; completing the consolidated reports per period; adding a request rate limit in the gateway; and, if the project moves beyond the academic setting, adopting RS256 signing, refresh tokens, Outbox, populated auditing, and a database or database login per service [Patiño Cabrera et al. 2026c].</w:t>
       </w:r>
     </w:p>
     <w:bookmarkEnd w:id="110"/>

</xml_diff>

<commit_message>
docs(article): replace the hand drawn figures and update the cited versions
</commit_message>
<xml_diff>
--- a/10_ARTICULO_DEL_PROYECTO/WORD/10_Articulo_Del_Proyecto_ACM.docx
+++ b/10_ARTICULO_DEL_PROYECTO/WORD/10_Articulo_Del_Proyecto_ACM.docx
@@ -234,7 +234,7 @@
         <w:pStyle w:val="FirstParagraph"/>
       </w:pPr>
       <w:r>
-        <w:t xml:space="preserve">Los objetivos vigentes del proyecto están en la versión 7.0 de la SRS [Guilombo Osorio et al. 2026].</w:t>
+        <w:t xml:space="preserve">Los objetivos vigentes del proyecto están en la versión 7.6 de la SRS [Guilombo Osorio et al. 2026].</w:t>
       </w:r>
     </w:p>
     <w:p>
@@ -543,7 +543,7 @@
         <w:pStyle w:val="FirstParagraph"/>
       </w:pPr>
       <w:r>
-        <w:t xml:space="preserve">Se trata de un trabajo de desarrollo tecnológico aplicado, presentado como estudio de caso único y de alcance descriptivo. La unidad de análisis es el sistema construido. La evidencia proviene de los artefactos del proyecto: el código de once repositorios, la documentación de diseño (requisitos, quince ADR, modelos de datos, contratos OpenAPI), los manuales técnicos verificados contra el código y los registros de pruebas y de acciones de mejora [Patiño Cabrera et al. 2026a; Patiño Cabrera et al. 2026b]. La SRS, en su versión 7.0, sigue la estructura de IEEE 830 [IEEE 1998] y los contenidos de ISO/IEC/IEEE 29148 [ISO/IEC/IEEE 2018], y define 41 requisitos funcionales, 12 requisitos no funcionales clasificados según el modelo de calidad de ISO/IEC 25010 [ISO/IEC 2023], 32 casos de uso y una matriz de trazabilidad con el estado de cada requisito [Guilombo Osorio et al. 2026].</w:t>
+        <w:t xml:space="preserve">Se trata de un trabajo de desarrollo tecnológico aplicado, presentado como estudio de caso único y de alcance descriptivo. La unidad de análisis es el sistema construido. La evidencia proviene de los artefactos del proyecto: el código de once repositorios, la documentación de diseño (requisitos, quince ADR, modelos de datos, contratos OpenAPI), los manuales técnicos verificados contra el código y los registros de pruebas y de acciones de mejora [Patiño Cabrera et al. 2026a; Patiño Cabrera et al. 2026b]. La SRS, en su versión 7.6, sigue la estructura de IEEE 830 [IEEE 1998] y los contenidos de ISO/IEC/IEEE 29148 [ISO/IEC/IEEE 2018], y define 41 requisitos funcionales, 12 requisitos no funcionales clasificados según el modelo de calidad de ISO/IEC 25010 [ISO/IEC 2023], 32 casos de uso y una matriz de trazabilidad con el estado de cada requisito [Guilombo Osorio et al. 2026].</w:t>
       </w:r>
     </w:p>
     <w:bookmarkEnd w:id="31"/>
@@ -621,7 +621,7 @@
         <w:t xml:space="preserve"> </w:t>
       </w:r>
       <w:r>
-        <w:t xml:space="preserve">y aprobaron el cierre de cada sprint; el líder de proyecto actuó como</w:t>
+        <w:t xml:space="preserve">y aprobó el cierre de cada sprint; el líder de proyecto actuó como</w:t>
       </w:r>
       <w:r>
         <w:t xml:space="preserve"> </w:t>
@@ -1224,29 +1224,20 @@
       <w:r>
         <w:drawing>
           <wp:inline>
-            <wp:extent cx="5334000" cy="3667125"/>
+            <wp:extent cx="5334000" cy="8152534"/>
             <wp:effectExtent b="0" l="0" r="0" t="0"/>
-            <wp:docPr descr="Diagrama de Contenedores del Sistema" title="" id="39" name="Picture"/>
+            <wp:docPr descr="" title="" id="39" name="Picture"/>
             <a:graphic>
               <a:graphicData uri="http://schemas.openxmlformats.org/drawingml/2006/picture">
                 <pic:pic>
                   <pic:nvPicPr>
-                    <pic:cNvPr descr="capturas/arquitectura_es.svg" id="40" name="Picture"/>
+                    <pic:cNvPr descr="diagrama-1.png" id="40" name="Picture"/>
                     <pic:cNvPicPr>
                       <a:picLocks noChangeArrowheads="1" noChangeAspect="1"/>
                     </pic:cNvPicPr>
                   </pic:nvPicPr>
                   <pic:blipFill>
-                    <a:blip>
-                      <a:extLst>
-                        <a:ext uri="{28A0092B-C50C-407E-A947-70E740481C1C}">
-                          <a14:useLocalDpi xmlns:a14="http://schemas.microsoft.com/office/drawing/2010/main" val="0"/>
-                        </a:ext>
-                        <a:ext uri="{96DAC541-7B7A-43D3-8B79-37D633B846F1}">
-                          <asvg:svgBlip xmlns:asvg="http://schemas.microsoft.com/office/drawing/2016/SVG/main" r:embed="rId38"/>
-                        </a:ext>
-                      </a:extLst>
-                    </a:blip>
+                    <a:blip r:embed="rId38"/>
                     <a:stretch>
                       <a:fillRect/>
                     </a:stretch>
@@ -1254,7 +1245,7 @@
                   <pic:spPr bwMode="auto">
                     <a:xfrm>
                       <a:off x="0" y="0"/>
-                      <a:ext cx="5334000" cy="3667125"/>
+                      <a:ext cx="5334000" cy="8152534"/>
                     </a:xfrm>
                     <a:prstGeom prst="rect">
                       <a:avLst/>
@@ -1837,7 +1828,7 @@
         <w:pStyle w:val="BodyText"/>
       </w:pPr>
       <w:r>
-        <w:t xml:space="preserve">La comunicación síncrona (REST) se usa cuando quien llama necesita una respuesta para continuar, por ejemplo, cuando el servicio de reservas consulta al servicio de clientes si el vehículo pertenece a quien reserva. La comunicación asíncrona usa un solo exchange de RabbitMQ y once tipos de evento publicados (entre ellos</w:t>
+        <w:t xml:space="preserve">La comunicación síncrona (REST) se usa cuando quien llama necesita una respuesta para continuar, por ejemplo, cuando el servicio de reservas consulta al servicio de clientes si el vehículo pertenece a quien reserva. La comunicación asíncrona usa un solo exchange de RabbitMQ y doce tipos de evento publicados (entre ellos</w:t>
       </w:r>
       <w:r>
         <w:t xml:space="preserve"> </w:t>
@@ -2233,29 +2224,20 @@
       <w:r>
         <w:drawing>
           <wp:inline>
-            <wp:extent cx="5334000" cy="2580967"/>
+            <wp:extent cx="5334000" cy="958203"/>
             <wp:effectExtent b="0" l="0" r="0" t="0"/>
-            <wp:docPr descr="Diagrama de Estados de la Reserva" title="" id="43" name="Picture"/>
+            <wp:docPr descr="" title="" id="43" name="Picture"/>
             <a:graphic>
               <a:graphicData uri="http://schemas.openxmlformats.org/drawingml/2006/picture">
                 <pic:pic>
                   <pic:nvPicPr>
-                    <pic:cNvPr descr="capturas/estados_reserva_es.svg" id="44" name="Picture"/>
+                    <pic:cNvPr descr="diagrama-2.png" id="44" name="Picture"/>
                     <pic:cNvPicPr>
                       <a:picLocks noChangeArrowheads="1" noChangeAspect="1"/>
                     </pic:cNvPicPr>
                   </pic:nvPicPr>
                   <pic:blipFill>
-                    <a:blip>
-                      <a:extLst>
-                        <a:ext uri="{28A0092B-C50C-407E-A947-70E740481C1C}">
-                          <a14:useLocalDpi xmlns:a14="http://schemas.microsoft.com/office/drawing/2010/main" val="0"/>
-                        </a:ext>
-                        <a:ext uri="{96DAC541-7B7A-43D3-8B79-37D633B846F1}">
-                          <asvg:svgBlip xmlns:asvg="http://schemas.microsoft.com/office/drawing/2016/SVG/main" r:embed="rId42"/>
-                        </a:ext>
-                      </a:extLst>
-                    </a:blip>
+                    <a:blip r:embed="rId42"/>
                     <a:stretch>
                       <a:fillRect/>
                     </a:stretch>
@@ -2263,7 +2245,7 @@
                   <pic:spPr bwMode="auto">
                     <a:xfrm>
                       <a:off x="0" y="0"/>
-                      <a:ext cx="5334000" cy="2580967"/>
+                      <a:ext cx="5334000" cy="958203"/>
                     </a:xfrm>
                     <a:prstGeom prst="rect">
                       <a:avLst/>
@@ -2523,7 +2505,7 @@
         <w:t xml:space="preserve"> </w:t>
       </w:r>
       <w:r>
-        <w:t xml:space="preserve">Elaborado a partir de la matriz de trazabilidad de la SRS, versión 7.0 [Guilombo Osorio et al. 2026].</w:t>
+        <w:t xml:space="preserve">Elaborado a partir de la matriz de trazabilidad de la SRS, versión 7.6 [Guilombo Osorio et al. 2026].</w:t>
       </w:r>
     </w:p>
     <w:p>
@@ -4268,7 +4250,7 @@
         <w:t xml:space="preserve"> </w:t>
       </w:r>
       <w:r>
-        <w:t xml:space="preserve">(Versión 7.0). Documento no publicado. Servicio Nacional de Aprendizaje.</w:t>
+        <w:t xml:space="preserve">(Versión 7.6). Documento no publicado. Servicio Nacional de Aprendizaje.</w:t>
       </w:r>
     </w:p>
     <w:p>
@@ -5341,7 +5323,7 @@
         <w:pStyle w:val="FirstParagraph"/>
       </w:pPr>
       <w:r>
-        <w:t xml:space="preserve">The current project objectives are stated in version 7.0 of the SRS [Guilombo Osorio et al. 2026].</w:t>
+        <w:t xml:space="preserve">The current project objectives are stated in version 7.6 of the SRS [Guilombo Osorio et al. 2026].</w:t>
       </w:r>
     </w:p>
     <w:p>
@@ -5637,7 +5619,7 @@
         <w:pStyle w:val="FirstParagraph"/>
       </w:pPr>
       <w:r>
-        <w:t xml:space="preserve">This is an applied technological development work, presented as a single, descriptive case study. The unit of analysis is the system that was built. The evidence comes from the project artifacts: the code of eleven repositories, the design documentation (requirements, fifteen ADRs, data models, OpenAPI contracts), the technical manuals verified against the code, and the test and improvement action records [Patiño Cabrera et al. 2026a; Patiño Cabrera et al. 2026c]. Version 7.0 of the SRS follows the structure of IEEE 830 [IEEE 1998] and the contents of ISO/IEC/IEEE 29148 [ISO/IEC/IEEE 2018], and defines 41 functional requirements, 12 non-functional requirements classified according to the ISO/IEC 25010 quality model [ISO/IEC 2023], 32 use cases, and a traceability matrix with the status of each requirement [Guilombo Osorio et al. 2026].</w:t>
+        <w:t xml:space="preserve">This is an applied technological development work, presented as a single, descriptive case study. The unit of analysis is the system that was built. The evidence comes from the project artifacts: the code of eleven repositories, the design documentation (requirements, fifteen ADRs, data models, OpenAPI contracts), the technical manuals verified against the code, and the test and improvement action records [Patiño Cabrera et al. 2026a; Patiño Cabrera et al. 2026c]. Version 7.6 of the SRS follows the structure of IEEE 830 [IEEE 1998] and the contents of ISO/IEC/IEEE 29148 [ISO/IEC/IEEE 2018], and defines 41 functional requirements, 12 non-functional requirements classified according to the ISO/IEC 25010 quality model [ISO/IEC 2023], 32 use cases, and a traceability matrix with the status of each requirement [Guilombo Osorio et al. 2026].</w:t>
       </w:r>
     </w:p>
     <w:bookmarkEnd w:id="86"/>
@@ -6254,29 +6236,20 @@
       <w:r>
         <w:drawing>
           <wp:inline>
-            <wp:extent cx="5334000" cy="3667125"/>
+            <wp:extent cx="5334000" cy="7936871"/>
             <wp:effectExtent b="0" l="0" r="0" t="0"/>
-            <wp:docPr descr="System Container Diagram" title="" id="94" name="Picture"/>
+            <wp:docPr descr="" title="" id="94" name="Picture"/>
             <a:graphic>
               <a:graphicData uri="http://schemas.openxmlformats.org/drawingml/2006/picture">
                 <pic:pic>
                   <pic:nvPicPr>
-                    <pic:cNvPr descr="capturas/arquitectura_en.svg" id="95" name="Picture"/>
+                    <pic:cNvPr descr="diagrama-3.png" id="95" name="Picture"/>
                     <pic:cNvPicPr>
                       <a:picLocks noChangeArrowheads="1" noChangeAspect="1"/>
                     </pic:cNvPicPr>
                   </pic:nvPicPr>
                   <pic:blipFill>
-                    <a:blip>
-                      <a:extLst>
-                        <a:ext uri="{28A0092B-C50C-407E-A947-70E740481C1C}">
-                          <a14:useLocalDpi xmlns:a14="http://schemas.microsoft.com/office/drawing/2010/main" val="0"/>
-                        </a:ext>
-                        <a:ext uri="{96DAC541-7B7A-43D3-8B79-37D633B846F1}">
-                          <asvg:svgBlip xmlns:asvg="http://schemas.microsoft.com/office/drawing/2016/SVG/main" r:embed="rId93"/>
-                        </a:ext>
-                      </a:extLst>
-                    </a:blip>
+                    <a:blip r:embed="rId93"/>
                     <a:stretch>
                       <a:fillRect/>
                     </a:stretch>
@@ -6284,7 +6257,7 @@
                   <pic:spPr bwMode="auto">
                     <a:xfrm>
                       <a:off x="0" y="0"/>
-                      <a:ext cx="5334000" cy="3667125"/>
+                      <a:ext cx="5334000" cy="7936871"/>
                     </a:xfrm>
                     <a:prstGeom prst="rect">
                       <a:avLst/>
@@ -6867,7 +6840,7 @@
         <w:pStyle w:val="BodyText"/>
       </w:pPr>
       <w:r>
-        <w:t xml:space="preserve">Synchronous communication (REST) is used when the caller needs a response to continue, for example, when the booking service asks the customer service whether the vehicle belongs to the person booking. Asynchronous communication uses a single RabbitMQ exchange and eleven published event types (among them</w:t>
+        <w:t xml:space="preserve">Synchronous communication (REST) is used when the caller needs a response to continue, for example, when the booking service asks the customer service whether the vehicle belongs to the person booking. Asynchronous communication uses a single RabbitMQ exchange and twelve published event types (among them</w:t>
       </w:r>
       <w:r>
         <w:t xml:space="preserve"> </w:t>
@@ -7251,29 +7224,20 @@
       <w:r>
         <w:drawing>
           <wp:inline>
-            <wp:extent cx="5334000" cy="2580967"/>
+            <wp:extent cx="5334000" cy="996233"/>
             <wp:effectExtent b="0" l="0" r="0" t="0"/>
-            <wp:docPr descr="Booking State Diagram" title="" id="98" name="Picture"/>
+            <wp:docPr descr="" title="" id="98" name="Picture"/>
             <a:graphic>
               <a:graphicData uri="http://schemas.openxmlformats.org/drawingml/2006/picture">
                 <pic:pic>
                   <pic:nvPicPr>
-                    <pic:cNvPr descr="capturas/estados_reserva_en.svg" id="99" name="Picture"/>
+                    <pic:cNvPr descr="diagrama-4.png" id="99" name="Picture"/>
                     <pic:cNvPicPr>
                       <a:picLocks noChangeArrowheads="1" noChangeAspect="1"/>
                     </pic:cNvPicPr>
                   </pic:nvPicPr>
                   <pic:blipFill>
-                    <a:blip>
-                      <a:extLst>
-                        <a:ext uri="{28A0092B-C50C-407E-A947-70E740481C1C}">
-                          <a14:useLocalDpi xmlns:a14="http://schemas.microsoft.com/office/drawing/2010/main" val="0"/>
-                        </a:ext>
-                        <a:ext uri="{96DAC541-7B7A-43D3-8B79-37D633B846F1}">
-                          <asvg:svgBlip xmlns:asvg="http://schemas.microsoft.com/office/drawing/2016/SVG/main" r:embed="rId97"/>
-                        </a:ext>
-                      </a:extLst>
-                    </a:blip>
+                    <a:blip r:embed="rId97"/>
                     <a:stretch>
                       <a:fillRect/>
                     </a:stretch>
@@ -7281,7 +7245,7 @@
                   <pic:spPr bwMode="auto">
                     <a:xfrm>
                       <a:off x="0" y="0"/>
-                      <a:ext cx="5334000" cy="2580967"/>
+                      <a:ext cx="5334000" cy="996233"/>
                     </a:xfrm>
                     <a:prstGeom prst="rect">
                       <a:avLst/>
@@ -7541,7 +7505,7 @@
         <w:t xml:space="preserve"> </w:t>
       </w:r>
       <w:r>
-        <w:t xml:space="preserve">Based on the traceability matrix of the SRS, version 7.0 [Guilombo Osorio et al. 2026].</w:t>
+        <w:t xml:space="preserve">Based on the traceability matrix of the SRS, version 7.6 [Guilombo Osorio et al. 2026].</w:t>
       </w:r>
     </w:p>
     <w:p>
@@ -9233,7 +9197,7 @@
         <w:t xml:space="preserve"> </w:t>
       </w:r>
       <w:r>
-        <w:t xml:space="preserve">[Software requirements specification (SRS) of the LavaRápido system: Web and mobile booking and management platform for a car wash] (Version 7.0). Unpublished document. Servicio Nacional de Aprendizaje.</w:t>
+        <w:t xml:space="preserve">[Software requirements specification (SRS) of the LavaRápido system: Web and mobile booking and management platform for a car wash] (Version 7.6). Unpublished document. Servicio Nacional de Aprendizaje.</w:t>
       </w:r>
     </w:p>
     <w:p>

</xml_diff>

<commit_message>
docs(article): update the ACM article with the corrected expired bookings rule and the 707 tests
</commit_message>
<xml_diff>
--- a/10_ARTICULO_DEL_PROYECTO/WORD/10_Articulo_Del_Proyecto_ACM.docx
+++ b/10_ARTICULO_DEL_PROYECTO/WORD/10_Articulo_Del_Proyecto_ACM.docx
@@ -70,7 +70,7 @@
           <w:i/>
           <w:iCs/>
         </w:rPr>
-        <w:t xml:space="preserve">Tecnólogo en Análisis y Desarrollo de Software (ADSO), ficha 3145556. Instructora: Karol Daniela Correa. 16 de octubre de 2026.</w:t>
+        <w:t xml:space="preserve">Tecnólogo en Análisis y Desarrollo de Software (ADSO), ficha 3145556. Instructora: Karol Daniela Correa. 21 de octubre de 2026.</w:t>
       </w:r>
     </w:p>
     <w:p>
@@ -88,7 +88,7 @@
         <w:t xml:space="preserve"> </w:t>
       </w:r>
       <w:r>
-        <w:t xml:space="preserve">Este artículo describe el diseño, la implementación y la verificación de Vehicle Washing (LavaRapido), una plataforma web y Android para un lavadero vehicular de una sola sede, desarrollada como proyecto formativo del SENA. El problema documentado es que las reservas por llamada, los registros a mano, la asignación discrecional del trabajo y los pagos en efectivo sin registro no dejan trazabilidad sobre turnos, servicios ni pagos. El trabajo siguió un enfoque de documentación de diseño de software (SDD) con siete sprints inspirados en Scrum, y su alcance evolucionó desde un servicio móvil por zonas con pasarela de pagos hacia un lavadero de sede única con pagos por QR o transferencia con comprobante revisado por el administrador, o en efectivo. La solución integra seis microservicios (cinco en Java 21 con Spring Boot 4 y uno en .NET 8) detrás de un API Gateway, SQL Server 2022 con 57 tablas, RabbitMQ y clientes en Angular 21 y React Native. Al 16 de octubre de 2026, 40 de los 41 requisitos funcionales estaban implementados y 1 era parcial. El 19 de octubre de 2026 se ejecutaron 655 pruebas automatizadas, todas aprobadas (incluidas 7 de persistencia contra una base aislada), y 19 pruebas de punta a punta y 42 casos funcionales contra el sistema completo, también aprobadas. El sistema corre además en un servidor público en Azure. Desde el 19 de octubre de 2026, cada repositorio compila y corre sus pruebas con GitHub Actions en cada cambio. Quedan pendientes los reportes consolidados y un límite de solicitudes en el gateway. Los beneficios operativos siguen siendo una hipótesis, porque no se han medido con personas usuarias reales.</w:t>
+        <w:t xml:space="preserve">Este artículo describe el diseño, la implementación y la verificación de Vehicle Washing (LavaRapido), una plataforma web y Android para un lavadero vehicular de una sola sede, desarrollada como proyecto formativo del SENA. El problema documentado es que las reservas por llamada, los registros a mano, la asignación discrecional del trabajo y los pagos en efectivo sin registro no dejan trazabilidad sobre turnos, servicios ni pagos. El trabajo siguió un enfoque de documentación de diseño de software (SDD) con siete sprints inspirados en Scrum, y su alcance evolucionó desde un servicio móvil por zonas con pasarela de pagos hacia un lavadero de sede única con pagos por QR o transferencia con comprobante revisado por el administrador, o en efectivo. La solución integra seis microservicios (cinco en Java 21 con Spring Boot 4 y uno en .NET 8) detrás de un API Gateway, SQL Server 2022 con 57 tablas, RabbitMQ y clientes en Angular 21 y React Native. Al 21 de octubre de 2026, 40 de los 41 requisitos funcionales estaban implementados y 1 era parcial. Ese día se ejecutaron 707 pruebas automatizadas, todas aprobadas (incluidas 7 de persistencia contra una base aislada), y 19 pruebas de punta a punta contra el sistema completo, también aprobadas; los 42 casos funcionales pasaron el 19 de octubre de 2026. El sistema corre además en un servidor público en Azure. Desde el 19 de octubre de 2026, cada repositorio compila y corre sus pruebas con GitHub Actions en cada cambio. Quedan pendientes los reportes consolidados y un límite de solicitudes en el gateway. Los beneficios operativos siguen siendo una hipótesis, porque no se han medido con personas usuarias reales.</w:t>
       </w:r>
     </w:p>
     <w:p>
@@ -234,7 +234,7 @@
         <w:pStyle w:val="FirstParagraph"/>
       </w:pPr>
       <w:r>
-        <w:t xml:space="preserve">Los objetivos vigentes del proyecto están en la versión 7.6 de la SRS [Guilombo Osorio et al. 2026].</w:t>
+        <w:t xml:space="preserve">Los objetivos vigentes del proyecto están en la versión 7.7 de la SRS [Guilombo Osorio et al. 2026].</w:t>
       </w:r>
     </w:p>
     <w:p>
@@ -543,7 +543,7 @@
         <w:pStyle w:val="FirstParagraph"/>
       </w:pPr>
       <w:r>
-        <w:t xml:space="preserve">Se trata de un trabajo de desarrollo tecnológico aplicado, presentado como estudio de caso único y de alcance descriptivo. La unidad de análisis es el sistema construido. La evidencia proviene de los artefactos del proyecto: el código de once repositorios, la documentación de diseño (requisitos, quince ADR, modelos de datos, contratos OpenAPI), los manuales técnicos verificados contra el código y los registros de pruebas y de acciones de mejora [Patiño Cabrera et al. 2026a; Patiño Cabrera et al. 2026b]. La SRS, en su versión 7.6, sigue la estructura de IEEE 830 [IEEE 1998] y los contenidos de ISO/IEC/IEEE 29148 [ISO/IEC/IEEE 2018], y define 41 requisitos funcionales, 12 requisitos no funcionales clasificados según el modelo de calidad de ISO/IEC 25010 [ISO/IEC 2023], 32 casos de uso y una matriz de trazabilidad con el estado de cada requisito [Guilombo Osorio et al. 2026].</w:t>
+        <w:t xml:space="preserve">Se trata de un trabajo de desarrollo tecnológico aplicado, presentado como estudio de caso único y de alcance descriptivo. La unidad de análisis es el sistema construido. La evidencia proviene de los artefactos del proyecto: el código de once repositorios, la documentación de diseño (requisitos, quince ADR, modelos de datos, contratos OpenAPI), los manuales técnicos verificados contra el código y los registros de pruebas y de acciones de mejora [Patiño Cabrera et al. 2026a; Patiño Cabrera et al. 2026b]. La SRS, en su versión 7.7, sigue la estructura de IEEE 830 [IEEE 1998] y los contenidos de ISO/IEC/IEEE 29148 [ISO/IEC/IEEE 2018], y define 41 requisitos funcionales, 12 requisitos no funcionales clasificados según el modelo de calidad de ISO/IEC 25010 [ISO/IEC 2023], 32 casos de uso y una matriz de trazabilidad con el estado de cada requisito [Guilombo Osorio et al. 2026].</w:t>
       </w:r>
     </w:p>
     <w:bookmarkEnd w:id="31"/>
@@ -1141,7 +1141,7 @@
         <w:pStyle w:val="FirstParagraph"/>
       </w:pPr>
       <w:r>
-        <w:t xml:space="preserve">El estado de los requisitos se tomó de la matriz de trazabilidad de la SRS, verificada contra el código el 16 de octubre de 2026 [Guilombo Osorio et al. 2026]. Las pruebas se volvieron a ejecutar el 19 de octubre de 2026: las suites de cada servicio Java con el Maven Wrapper, las de payment-service con el SDK de .NET (destino</w:t>
+        <w:t xml:space="preserve">El estado de los requisitos se tomó de la matriz de trazabilidad de la SRS, verificada contra el código el 21 de octubre de 2026 [Guilombo Osorio et al. 2026]. Las pruebas se volvieron a ejecutar el 21 de octubre de 2026: las suites de cada servicio Java con el Maven Wrapper, las de payment-service con el SDK de .NET (destino</w:t>
       </w:r>
       <w:r>
         <w:t xml:space="preserve"> </w:t>
@@ -1154,7 +1154,7 @@
         <w:t xml:space="preserve">net8.0</w:t>
       </w:r>
       <w:r>
-        <w:t xml:space="preserve">), las de la web con Vitest, y las pruebas de punta a punta de</w:t>
+        <w:t xml:space="preserve">), las de la web con Vitest y las pruebas de punta a punta de</w:t>
       </w:r>
       <w:r>
         <w:t xml:space="preserve"> </w:t>
@@ -1170,7 +1170,7 @@
         <w:t xml:space="preserve"> </w:t>
       </w:r>
       <w:r>
-        <w:t xml:space="preserve">y los 42 casos funcionales contra el sistema completo.</w:t>
+        <w:t xml:space="preserve">contra el sistema completo; los 42 casos funcionales se ejecutaron el 19 de octubre de 2026.</w:t>
       </w:r>
     </w:p>
     <w:bookmarkEnd w:id="36"/>
@@ -1214,7 +1214,7 @@
         <w:t xml:space="preserve"> </w:t>
       </w:r>
       <w:r>
-        <w:t xml:space="preserve">hacia el servicio dueño y no valida tokens: cada servicio verifica el JWT por sí mismo. Los cinco servicios Java siguen la arquitectura hexagonal (dominio, aplicación e infraestructura, con un dominio que no importa Spring ni JPA), y el servicio de pagos sigue una arquitectura por capas en .NET con el mismo contrato de seguridad y de errores [Patiño Cabrera et al. 2026b].</w:t>
+        <w:t xml:space="preserve">hacia el servicio dueño y no verifica la firma de los tokens: cada servicio verifica el JWT por sí mismo. Desde el 21 de octubre de 2026 el gateway sí confirma con security-service que la sesión del token siga abierta, de modo que un token deja de servir cuando se cierra la sesión. Los cinco servicios Java siguen la arquitectura hexagonal (dominio, aplicación e infraestructura, con un dominio que no importa Spring ni JPA), y el servicio de pagos sigue una arquitectura por capas en .NET con el mismo contrato de seguridad y de errores [Patiño Cabrera et al. 2026b].</w:t>
       </w:r>
     </w:p>
     <w:p>
@@ -2224,7 +2224,7 @@
       <w:r>
         <w:drawing>
           <wp:inline>
-            <wp:extent cx="5334000" cy="958203"/>
+            <wp:extent cx="5334000" cy="974173"/>
             <wp:effectExtent b="0" l="0" r="0" t="0"/>
             <wp:docPr descr="" title="" id="43" name="Picture"/>
             <a:graphic>
@@ -2245,7 +2245,7 @@
                   <pic:spPr bwMode="auto">
                     <a:xfrm>
                       <a:off x="0" y="0"/>
-                      <a:ext cx="5334000" cy="958203"/>
+                      <a:ext cx="5334000" cy="974173"/>
                     </a:xfrm>
                     <a:prstGeom prst="rect">
                       <a:avLst/>
@@ -2297,7 +2297,33 @@
         <w:t xml:space="preserve"> </w:t>
       </w:r>
       <w:r>
-        <w:t xml:space="preserve">Los estados en gris son finales. Tomado del manual técnico [Patiño Cabrera et al. 2026b], con las etiquetas traducidas.</w:t>
+        <w:t xml:space="preserve">Los estados en gris son finales.</w:t>
+      </w:r>
+      <w:r>
+        <w:t xml:space="preserve"> </w:t>
+      </w:r>
+      <w:r>
+        <w:rPr>
+          <w:i/>
+          <w:iCs/>
+        </w:rPr>
+        <w:t xml:space="preserve">Vencida</w:t>
+      </w:r>
+      <w:r>
+        <w:t xml:space="preserve">: el sistema cancela la reserva programada que nadie confirmó una hora después de su hora de fin;</w:t>
+      </w:r>
+      <w:r>
+        <w:t xml:space="preserve"> </w:t>
+      </w:r>
+      <w:r>
+        <w:rPr>
+          <w:i/>
+          <w:iCs/>
+        </w:rPr>
+        <w:t xml:space="preserve">terminó sin operario</w:t>
+      </w:r>
+      <w:r>
+        <w:t xml:space="preserve">: en el mismo plazo, la confirmada que nunca tuvo operario pasa a NO_SHOW. La confirmada con operario que nadie registró la cierra el administrador. Tomado del manual técnico [Patiño Cabrera et al. 2026b], con las etiquetas traducidas.</w:t>
       </w:r>
     </w:p>
     <w:bookmarkEnd w:id="45"/>
@@ -2315,7 +2341,7 @@
         <w:pStyle w:val="FirstParagraph"/>
       </w:pPr>
       <w:r>
-        <w:t xml:space="preserve">La SRS define 41 requisitos funcionales: los 29 originales (RF-001 a RF-026, con RF-004b, RF-012b y RF-013b), 9 que se incorporaron en la versión 4.0 porque describían funciones ya construidas (RF-027 a RF-035) y 3 de la versión 6.0 (RF-036 a RF-038: informe de inspección, datos del negocio y ficha del operario). La Tabla 4 resume su estado al 16 de octubre de 2026: 40 implementados (98 %) y 1 parcial.</w:t>
+        <w:t xml:space="preserve">La SRS define 41 requisitos funcionales: los 29 originales (RF-001 a RF-026, con RF-004b, RF-012b y RF-013b), 9 que se incorporaron en la versión 4.0 porque describían funciones ya construidas (RF-027 a RF-035) y 3 de la versión 6.0 (RF-036 a RF-038: informe de inspección, datos del negocio y ficha del operario). La Tabla 4 resume su estado al 21 de octubre de 2026: 40 implementados (98 %) y 1 parcial.</w:t>
       </w:r>
     </w:p>
     <w:p>
@@ -2333,7 +2359,7 @@
         <w:t xml:space="preserve"> </w:t>
       </w:r>
       <w:r>
-        <w:t xml:space="preserve">Estado de los Requisitos Funcionales al 16 de Octubre de 2026</w:t>
+        <w:t xml:space="preserve">Estado de los Requisitos Funcionales al 21 de Octubre de 2026</w:t>
       </w:r>
     </w:p>
     <w:tbl>
@@ -2505,7 +2531,7 @@
         <w:t xml:space="preserve"> </w:t>
       </w:r>
       <w:r>
-        <w:t xml:space="preserve">Elaborado a partir de la matriz de trazabilidad de la SRS, versión 7.6 [Guilombo Osorio et al. 2026].</w:t>
+        <w:t xml:space="preserve">Elaborado a partir de la matriz de trazabilidad de la SRS, versión 7.7 [Guilombo Osorio et al. 2026].</w:t>
       </w:r>
     </w:p>
     <w:p>
@@ -2521,7 +2547,7 @@
         <w:pStyle w:val="BodyText"/>
       </w:pPr>
       <w:r>
-        <w:t xml:space="preserve">De los 12 requisitos no funcionales, 5 están implementados y 7 son parciales [Guilombo Osorio et al. 2026]. Los implementados son el tiempo de respuesta (el percentil 95 más alto, medido el 14 de octubre de 2026, fue de 686 ms frente a una meta de 2 segundos), la disponibilidad durante las sesiones de revisión, la seguridad, la idempotencia de los eventos y la tolerancia a fallos de los servicios externos. Los parciales son la integridad y la concurrencia (faltan pruebas de integración contra SQL Server), la observabilidad, la mantenibilidad, la portabilidad, la compatibilidad (las pantallas web no se salen de 360 px, pero falta probar en un dispositivo con Android 8), la usabilidad (sin prueba con personas usuarias) y la localización.</w:t>
+        <w:t xml:space="preserve">De los 12 requisitos no funcionales, 5 están implementados y 7 son parciales [Guilombo Osorio et al. 2026]. Los implementados son el tiempo de respuesta (el percentil 95 más alto, medido el 14 de octubre de 2026, fue de 686 ms frente a una meta de 2 segundos), la disponibilidad durante las sesiones de revisión, la seguridad, la idempotencia de los eventos y la tolerancia a fallos de los servicios externos. Los parciales son la integridad y la concurrencia (las reservas y las asignaciones ya se hacen una a la vez con candados de la base de datos, pero faltan pruebas de integración contra SQL Server), la observabilidad, la mantenibilidad, la portabilidad, la compatibilidad (las pantallas web no se salen de 360 px, pero falta probar en un dispositivo con Android 8), la usabilidad (sin prueba con personas usuarias) y la localización.</w:t>
       </w:r>
     </w:p>
     <w:bookmarkEnd w:id="46"/>
@@ -2539,7 +2565,7 @@
         <w:pStyle w:val="FirstParagraph"/>
       </w:pPr>
       <w:r>
-        <w:t xml:space="preserve">El 19 de octubre de 2026 se ejecutaron todas las suites automatizadas: 655 pruebas aprobadas, ninguna fallida ni omitida; las 7 pruebas de persistencia de payment-service corrieron contra una base de pruebas aislada (Tabla 5). Ese mismo día pasaron las 19 pruebas de punta a punta de</w:t>
+        <w:t xml:space="preserve">En la noche del 21 de octubre de 2026 se ejecutaron todas las suites automatizadas: 707 pruebas aprobadas, ninguna fallida ni omitida; las 7 pruebas de persistencia de payment-service corrieron contra una base de pruebas aislada (Tabla 5). Ese mismo día pasaron las 19 pruebas de punta a punta de</w:t>
       </w:r>
       <w:r>
         <w:t xml:space="preserve"> </w:t>
@@ -2552,7 +2578,7 @@
         <w:t xml:space="preserve">lavarapido-infra/e2e</w:t>
       </w:r>
       <w:r>
-        <w:t xml:space="preserve">, que recorren el sistema completo: reserva con elección de operario y asignación automática, flujo de los tres roles con pago, aprobación, puntos, ejecución y calificación, informe de inspección con fotos y enlace público, y reglas de acceso por rol. La SRS registraba 347 pruebas el 6 de octubre [Guilombo Osorio et al. 2026]; la diferencia corresponde a las pruebas que se agregaron con cada función nueva.</w:t>
+        <w:t xml:space="preserve">, que recorren el sistema completo: reserva con elección de operario y asignación automática, flujo de los tres roles con pago, aprobación, puntos, ejecución y calificación, informe de inspección con fotos y enlace público, y reglas de acceso por rol, ya con el chequeo de sesión del gateway activo. La SRS registraba 347 pruebas el 6 de octubre [Guilombo Osorio et al. 2026]; la diferencia corresponde a las pruebas que se agregaron con cada función nueva.</w:t>
       </w:r>
     </w:p>
     <w:p>
@@ -2570,7 +2596,7 @@
         <w:t xml:space="preserve"> </w:t>
       </w:r>
       <w:r>
-        <w:t xml:space="preserve">Resultados de la Ejecución de las Pruebas Automatizadas (19 de Octubre de 2026)</w:t>
+        <w:t xml:space="preserve">Resultados de la Ejecución de las Pruebas Automatizadas (21 de Octubre de 2026)</w:t>
       </w:r>
     </w:p>
     <w:tbl>
@@ -2665,18 +2691,18 @@
               <w:pStyle w:val="Compact"/>
             </w:pPr>
             <w:r>
-              <w:t xml:space="preserve">43</w:t>
-            </w:r>
-          </w:p>
-        </w:tc>
-        <w:tc>
-          <w:tcPr/>
-          <w:p>
-            <w:pPr>
-              <w:pStyle w:val="Compact"/>
-            </w:pPr>
-            <w:r>
-              <w:t xml:space="preserve">43</w:t>
+              <w:t xml:space="preserve">62</w:t>
+            </w:r>
+          </w:p>
+        </w:tc>
+        <w:tc>
+          <w:tcPr/>
+          <w:p>
+            <w:pPr>
+              <w:pStyle w:val="Compact"/>
+            </w:pPr>
+            <w:r>
+              <w:t xml:space="preserve">62</w:t>
             </w:r>
           </w:p>
         </w:tc>
@@ -2722,18 +2748,18 @@
               <w:pStyle w:val="Compact"/>
             </w:pPr>
             <w:r>
-              <w:t xml:space="preserve">34</w:t>
-            </w:r>
-          </w:p>
-        </w:tc>
-        <w:tc>
-          <w:tcPr/>
-          <w:p>
-            <w:pPr>
-              <w:pStyle w:val="Compact"/>
-            </w:pPr>
-            <w:r>
-              <w:t xml:space="preserve">34</w:t>
+              <w:t xml:space="preserve">40</w:t>
+            </w:r>
+          </w:p>
+        </w:tc>
+        <w:tc>
+          <w:tcPr/>
+          <w:p>
+            <w:pPr>
+              <w:pStyle w:val="Compact"/>
+            </w:pPr>
+            <w:r>
+              <w:t xml:space="preserve">40</w:t>
             </w:r>
           </w:p>
         </w:tc>
@@ -2779,18 +2805,18 @@
               <w:pStyle w:val="Compact"/>
             </w:pPr>
             <w:r>
-              <w:t xml:space="preserve">151</w:t>
-            </w:r>
-          </w:p>
-        </w:tc>
-        <w:tc>
-          <w:tcPr/>
-          <w:p>
-            <w:pPr>
-              <w:pStyle w:val="Compact"/>
-            </w:pPr>
-            <w:r>
-              <w:t xml:space="preserve">151</w:t>
+              <w:t xml:space="preserve">155</w:t>
+            </w:r>
+          </w:p>
+        </w:tc>
+        <w:tc>
+          <w:tcPr/>
+          <w:p>
+            <w:pPr>
+              <w:pStyle w:val="Compact"/>
+            </w:pPr>
+            <w:r>
+              <w:t xml:space="preserve">155</w:t>
             </w:r>
           </w:p>
         </w:tc>
@@ -2893,18 +2919,18 @@
               <w:pStyle w:val="Compact"/>
             </w:pPr>
             <w:r>
-              <w:t xml:space="preserve">43</w:t>
-            </w:r>
-          </w:p>
-        </w:tc>
-        <w:tc>
-          <w:tcPr/>
-          <w:p>
-            <w:pPr>
-              <w:pStyle w:val="Compact"/>
-            </w:pPr>
-            <w:r>
-              <w:t xml:space="preserve">43</w:t>
+              <w:t xml:space="preserve">50</w:t>
+            </w:r>
+          </w:p>
+        </w:tc>
+        <w:tc>
+          <w:tcPr/>
+          <w:p>
+            <w:pPr>
+              <w:pStyle w:val="Compact"/>
+            </w:pPr>
+            <w:r>
+              <w:t xml:space="preserve">50</w:t>
             </w:r>
           </w:p>
         </w:tc>
@@ -2950,18 +2976,18 @@
               <w:pStyle w:val="Compact"/>
             </w:pPr>
             <w:r>
-              <w:t xml:space="preserve">55</w:t>
-            </w:r>
-          </w:p>
-        </w:tc>
-        <w:tc>
-          <w:tcPr/>
-          <w:p>
-            <w:pPr>
-              <w:pStyle w:val="Compact"/>
-            </w:pPr>
-            <w:r>
-              <w:t xml:space="preserve">55</w:t>
+              <w:t xml:space="preserve">67</w:t>
+            </w:r>
+          </w:p>
+        </w:tc>
+        <w:tc>
+          <w:tcPr/>
+          <w:p>
+            <w:pPr>
+              <w:pStyle w:val="Compact"/>
+            </w:pPr>
+            <w:r>
+              <w:t xml:space="preserve">67</w:t>
             </w:r>
           </w:p>
         </w:tc>
@@ -3007,18 +3033,18 @@
               <w:pStyle w:val="Compact"/>
             </w:pPr>
             <w:r>
-              <w:t xml:space="preserve">112</w:t>
-            </w:r>
-          </w:p>
-        </w:tc>
-        <w:tc>
-          <w:tcPr/>
-          <w:p>
-            <w:pPr>
-              <w:pStyle w:val="Compact"/>
-            </w:pPr>
-            <w:r>
-              <w:t xml:space="preserve">112</w:t>
+              <w:t xml:space="preserve">114</w:t>
+            </w:r>
+          </w:p>
+        </w:tc>
+        <w:tc>
+          <w:tcPr/>
+          <w:p>
+            <w:pPr>
+              <w:pStyle w:val="Compact"/>
+            </w:pPr>
+            <w:r>
+              <w:t xml:space="preserve">114</w:t>
             </w:r>
           </w:p>
         </w:tc>
@@ -3064,18 +3090,18 @@
               <w:pStyle w:val="Compact"/>
             </w:pPr>
             <w:r>
-              <w:t xml:space="preserve">148</w:t>
-            </w:r>
-          </w:p>
-        </w:tc>
-        <w:tc>
-          <w:tcPr/>
-          <w:p>
-            <w:pPr>
-              <w:pStyle w:val="Compact"/>
-            </w:pPr>
-            <w:r>
-              <w:t xml:space="preserve">148</w:t>
+              <w:t xml:space="preserve">150</w:t>
+            </w:r>
+          </w:p>
+        </w:tc>
+        <w:tc>
+          <w:tcPr/>
+          <w:p>
+            <w:pPr>
+              <w:pStyle w:val="Compact"/>
+            </w:pPr>
+            <w:r>
+              <w:t xml:space="preserve">150</w:t>
             </w:r>
           </w:p>
         </w:tc>
@@ -3129,7 +3155,7 @@
                 <w:b/>
                 <w:bCs/>
               </w:rPr>
-              <w:t xml:space="preserve">655</w:t>
+              <w:t xml:space="preserve">707</w:t>
             </w:r>
           </w:p>
         </w:tc>
@@ -3144,7 +3170,7 @@
                 <w:b/>
                 <w:bCs/>
               </w:rPr>
-              <w:t xml:space="preserve">655</w:t>
+              <w:t xml:space="preserve">707</w:t>
             </w:r>
           </w:p>
         </w:tc>
@@ -3537,7 +3563,7 @@
         <w:pStyle w:val="FirstParagraph"/>
       </w:pPr>
       <w:r>
-        <w:t xml:space="preserve">Al 16 de octubre de 2026, el registro de acciones contenía 39 acciones correctivas cerradas, 2 correctivas abiertas, 14 preventivas y 13 de mejoramiento, de las cuales 5 ya están cerradas [Patiño Cabrera et al. 2026a]. El indicador de cierre de correctivas subió de 64 % el 9 de octubre a 95 % (39 de 41), por encima de la meta de 70 %, y la reincidencia fue de 0 %. Ya no quedan correctivas abiertas de severidad P0 ni P1: el bloqueo de cuenta (AC-25) y el registro del consentimiento (AC-26) se cerraron con pruebas. Entre las correcciones cerradas figuran defectos de alto impacto, como horas de reserva desplazadas cinco horas por el manejo de zonas horarias (AC-01), la posibilidad de pagar dos reservas con la misma referencia de transacción (AC-07), un libro de puntos sin reversión ni control de concurrencia (AC-09) y dos solicitudes simultáneas que intentaban crear el mismo operario (AC-35).</w:t>
+        <w:t xml:space="preserve">Al 21 de octubre de 2026, el registro de acciones contenía 52 acciones correctivas cerradas, 3 correctivas abiertas, 18 preventivas y 16 de mejoramiento, de las cuales 8 ya están cerradas [Patiño Cabrera et al. 2026a]. El indicador de cierre de correctivas subió de 64 % el 9 de octubre a 95 % (52 de 55), por encima de la meta de 70 %, y la reincidencia fue de 0 %. Ya no quedan correctivas abiertas de severidad P0 ni P1: el bloqueo de cuenta (AC-25) y el registro del consentimiento (AC-26) se cerraron con pruebas. Entre las correcciones cerradas figuran defectos de alto impacto, como horas de reserva desplazadas cinco horas por el manejo de zonas horarias (AC-01), la posibilidad de pagar dos reservas con la misma referencia de transacción (AC-07), un libro de puntos sin reversión ni control de concurrencia (AC-09) dos solicitudes simultáneas que intentaban crear el mismo operario (AC-35) y un token que seguía sirviendo hasta una hora después de cerrar sesión (AC-44).</w:t>
       </w:r>
     </w:p>
     <w:p>
@@ -3935,15 +3961,15 @@
         <w:pStyle w:val="BodyText"/>
       </w:pPr>
       <w:r>
-        <w:t xml:space="preserve">Garantizar las reglas críticas en la base de datos, y no solo en el código, resultó adecuado para un dominio con concurrencia: dos clientes que reservan la misma bahía o dos administradores que aprueban el mismo pago no dependen de que el código de la aplicación sea correcto en todos sus caminos. Las pruebas de persistencia de payment-service que cubren estos casos existen, pero necesitan una base de pruebas dedicada; la suite de punta a punta sí ejercita esas reglas contra el SQL Server real del entorno Docker.</w:t>
-      </w:r>
-    </w:p>
-    <w:p>
-      <w:pPr>
-        <w:pStyle w:val="BodyText"/>
-      </w:pPr>
-      <w:r>
-        <w:t xml:space="preserve">La aplicación de la arquitectura hexagonal [Cockburn 2005] se refleja en la forma de las pruebas: 648 de las 655 pruebas automatizadas se ejecutan sin base de datos, porque prueban el dominio, los casos de uso y la capa web con dobles de prueba en lugar de la infraestructura real, lo que las hace rápidas y deterministas. Desde el 19 de octubre de 2026 esas pruebas corren solas en cada cambio con GitHub Actions; sin embargo, la ausencia de medición de cobertura limita la confianza que estas cifras pueden dar, y la suite de punta a punta, que prueba los servicios integrados, todavía se corre a mano. La investigación de Forsgren et al. [2018] asocia la integración continua y la automatización de pruebas con un mejor desempeño en la entrega de software; por eso el proyecto cerró su deuda técnica TD-006 con GitHub Actions.</w:t>
+        <w:t xml:space="preserve">Garantizar las reglas críticas en la base de datos, y no solo en el código, resultó adecuado para un dominio con concurrencia: dos clientes que reservan la misma bahía o dos administradores que aprueban el mismo pago no dependen de que el código de la aplicación sea correcto en todos sus caminos. Con el mismo criterio, desde el 21 de octubre de 2026 la asignación manual y la automática de un operario se hacen una a la vez con un candado de SQL Server. La revisión del equipo encontró además un riesgo en la primera versión del cierre automático de reservas, del mismo día: marcaba como No asistió toda reserva confirmada que nadie iniciaba, de modo que un servicio atendido pero no registrado habría quedado como ausencia del cliente en el historial y en los reportes. El diseño se cambió para que el sistema decida solo cuando está seguro (la reserva que nunca tuvo operario) y deje las demás al administrador en una lista de reservas por cerrar. Las pruebas de persistencia de payment-service que cubren estos casos existen, pero necesitan una base de pruebas dedicada; la suite de punta a punta sí ejercita esas reglas contra el SQL Server real del entorno Docker.</w:t>
+      </w:r>
+    </w:p>
+    <w:p>
+      <w:pPr>
+        <w:pStyle w:val="BodyText"/>
+      </w:pPr>
+      <w:r>
+        <w:t xml:space="preserve">La aplicación de la arquitectura hexagonal [Cockburn 2005] se refleja en la forma de las pruebas: 700 de las 707 pruebas automatizadas se ejecutan sin base de datos, porque prueban el dominio, los casos de uso y la capa web con dobles de prueba en lugar de la infraestructura real, lo que las hace rápidas y deterministas. Desde el 19 de octubre de 2026 esas pruebas corren solas en cada cambio con GitHub Actions; sin embargo, la ausencia de medición de cobertura limita la confianza que estas cifras pueden dar, y la suite de punta a punta, que prueba los servicios integrados, todavía se corre a mano. La investigación de Forsgren et al. [2018] asocia la integración continua y la automatización de pruebas con un mejor desempeño en la entrega de software; por eso el proyecto cerró su deuda técnica TD-006 con GitHub Actions.</w:t>
       </w:r>
     </w:p>
     <w:p>
@@ -3968,7 +3994,7 @@
         <w:pStyle w:val="FirstParagraph"/>
       </w:pPr>
       <w:r>
-        <w:t xml:space="preserve">Este trabajo tiene limitaciones importantes. Primera, no hay evidencia con personas usuarias: el problema es una hipótesis documentada, no se ejecutaron los casos de aceptación y no hubo piloto, por lo que no se puede afirmar que el sistema reduzca conflictos, viajes perdidos o tiempos de gestión. Segunda, el servidor público es una sola máquina virtual que se enciende bajo demanda, sin alta disponibilidad ni un entorno de pruebas separado. Tercera, la verificación automatizada no incluye cobertura medida ni pruebas de persistencia de los servicios Java contra la base de datos real fuera de la suite de punta a punta. Cuarta, siguen abiertas mejoras de seguridad como un límite de solicitudes en el gateway, la auditoría poblada y un inicio de sesión de base de datos por servicio. Quinta, la SRS deja abiertas decisiones de negocio y de cumplimiento: si el pago debe estar aprobado antes de iniciar el servicio, la aplicación real de la matriz de permisos y una política de retención y supresión de datos personales [Guilombo Osorio et al. 2026]. Sexta, el caso es único y de pequeña escala, por lo que sus conclusiones no se pueden generalizar a otros negocios.</w:t>
+        <w:t xml:space="preserve">Este trabajo tiene limitaciones importantes. Primera, no hay evidencia con personas usuarias: el problema es una hipótesis documentada, no se ejecutaron los casos de aceptación y no hubo piloto, por lo que no se puede afirmar que el sistema reduzca conflictos, viajes perdidos o tiempos de gestión. Segunda, el servidor público es una sola máquina virtual que se enciende bajo demanda, sin alta disponibilidad ni un entorno de pruebas separado; desde el 21 de octubre de 2026 la base se respalda y se verifica todos los días, pero las copias quedan en el mismo disco. Tercera, la verificación automatizada no incluye cobertura medida ni pruebas de persistencia de los servicios Java contra la base de datos real fuera de la suite de punta a punta. Cuarta, siguen abiertas mejoras de seguridad como un límite de solicitudes en el gateway, la auditoría poblada y un inicio de sesión de base de datos por servicio. Quinta, la SRS deja abiertas decisiones de negocio y de cumplimiento: si el pago debe estar aprobado antes de iniciar el servicio, la aplicación real de la matriz de permisos y una política de retención y supresión de datos personales [Guilombo Osorio et al. 2026]. Sexta, el caso es único y de pequeña escala, por lo que sus conclusiones no se pueden generalizar a otros negocios.</w:t>
       </w:r>
     </w:p>
     <w:bookmarkEnd w:id="53"/>
@@ -3995,7 +4021,7 @@
         <w:pStyle w:val="BodyText"/>
       </w:pPr>
       <w:r>
-        <w:t xml:space="preserve">El estado verificado es favorable en lo técnico: 40 de 41 requisitos funcionales implementados, 655 pruebas automatizadas, 19 pruebas de punta a punta y 42 casos funcionales aprobados sin fallos, y el sistema desplegado en un servidor público con HTTPS. Las reglas críticas del negocio se garantizan en la base de datos, lo que protege el sistema frente a la concurrencia en reservas, pagos y puntos.</w:t>
+        <w:t xml:space="preserve">El estado verificado es favorable en lo técnico: 40 de 41 requisitos funcionales implementados, 707 pruebas automatizadas, 19 pruebas de punta a punta y 42 casos funcionales aprobados sin fallos, y el sistema desplegado en un servidor público con HTTPS. Las reglas críticas del negocio se garantizan en la base de datos, lo que protege el sistema frente a la concurrencia en reservas, asignaciones, pagos y puntos.</w:t>
       </w:r>
     </w:p>
     <w:p>
@@ -4250,7 +4276,7 @@
         <w:t xml:space="preserve"> </w:t>
       </w:r>
       <w:r>
-        <w:t xml:space="preserve">(Versión 7.6). Documento no publicado. Servicio Nacional de Aprendizaje.</w:t>
+        <w:t xml:space="preserve">(Versión 7.7). Documento no publicado. Servicio Nacional de Aprendizaje.</w:t>
       </w:r>
     </w:p>
     <w:p>
@@ -4647,7 +4673,7 @@
         <w:t xml:space="preserve"> </w:t>
       </w:r>
       <w:r>
-        <w:t xml:space="preserve">(Versión 2.0). Documento no publicado. Servicio Nacional de Aprendizaje.</w:t>
+        <w:t xml:space="preserve">(Versión 2.5). Documento no publicado. Servicio Nacional de Aprendizaje.</w:t>
       </w:r>
     </w:p>
     <w:p>
@@ -4671,7 +4697,7 @@
         <w:t xml:space="preserve"> </w:t>
       </w:r>
       <w:r>
-        <w:t xml:space="preserve">(Versión 4.0). Documento no publicado. Servicio Nacional de Aprendizaje.</w:t>
+        <w:t xml:space="preserve">(Versión 4.5). Documento no publicado. Servicio Nacional de Aprendizaje.</w:t>
       </w:r>
     </w:p>
     <w:p>
@@ -4695,7 +4721,7 @@
         <w:t xml:space="preserve"> </w:t>
       </w:r>
       <w:r>
-        <w:t xml:space="preserve">(Versión 2.0). Documento no publicado. Servicio Nacional de Aprendizaje.</w:t>
+        <w:t xml:space="preserve">(Versión 2.4). Documento no publicado. Servicio Nacional de Aprendizaje.</w:t>
       </w:r>
     </w:p>
     <w:p>
@@ -5159,7 +5185,7 @@
           <w:i/>
           <w:iCs/>
         </w:rPr>
-        <w:t xml:space="preserve">Technologist in Software Analysis and Development (ADSO), Ficha 3145556. Instructor: Karol Daniela Correa. October 16, 2026.</w:t>
+        <w:t xml:space="preserve">Technologist in Software Analysis and Development (ADSO), Ficha 3145556. Instructor: Karol Daniela Correa. October 21, 2026.</w:t>
       </w:r>
     </w:p>
     <w:p>
@@ -5177,7 +5203,7 @@
         <w:t xml:space="preserve"> </w:t>
       </w:r>
       <w:r>
-        <w:t xml:space="preserve">This article describes the design, implementation, and verification of Vehicle Washing (LavaRapido), a web and Android platform for a single-location car wash, developed as a training project in SENA's Technologist in Software Analysis and Development program. The documented problem is that bookings made by phone or in person, handwritten records, discretionary work assignment, and unrecorded cash payments leave no traceability over time slots, service execution, or payments. The work followed a software design documentation (SDD) approach with seven Scrum-inspired sprints. The scope evolved from a mobile, zone-based service with a payment gateway to a single-location car wash with payments by QR or transfer with a receipt reviewed by the administrator, or in cash. The solution consists of six domain microservices (five in Java 21 with Spring Boot 4 and one in .NET 8) behind an API gateway, a SQL Server 2022 database with nine schemas and 57 tables, RabbitMQ messaging, and Angular 21 and React Native clients. As of October 16, 2026, 40 of the 41 functional requirements were implemented and 1 was partial. On October 19, 2026, 655 automated tests were run and all passed (including 7 persistence tests against an isolated database), and 19 end-to-end tests and 42 functional cases against the complete system also passed. The system also runs on a public server on Azure. Since October 19, 2026, each repository builds and runs its tests with GitHub Actions on every change. The consolidated reports and a request rate limit in the gateway are still pending. The operational benefits for the business remain a hypothesis, because they have not yet been measured with real users.</w:t>
+        <w:t xml:space="preserve">This article describes the design, implementation, and verification of Vehicle Washing (LavaRapido), a web and Android platform for a single-location car wash, developed as a training project in SENA's Technologist in Software Analysis and Development program. The documented problem is that bookings made by phone or in person, handwritten records, discretionary work assignment, and unrecorded cash payments leave no traceability over time slots, service execution, or payments. The work followed a software design documentation (SDD) approach with seven Scrum-inspired sprints. The scope evolved from a mobile, zone-based service with a payment gateway to a single-location car wash with payments by QR or transfer with a receipt reviewed by the administrator, or in cash. The solution consists of six domain microservices (five in Java 21 with Spring Boot 4 and one in .NET 8) behind an API gateway, a SQL Server 2022 database with nine schemas and 57 tables, RabbitMQ messaging, and Angular 21 and React Native clients. As of October 21, 2026, 40 of the 41 functional requirements were implemented and 1 was partial. That day 707 automated tests were run and all passed (including 7 persistence tests against an isolated database), and 19 end-to-end tests against the complete system also passed; the 42 functional cases passed on October 19, 2026. The system also runs on a public server on Azure. Since October 19, 2026, each repository builds and runs its tests with GitHub Actions on every change. The consolidated reports and a request rate limit in the gateway are still pending. The operational benefits for the business remain a hypothesis, because they have not yet been measured with real users.</w:t>
       </w:r>
     </w:p>
     <w:p>
@@ -5323,7 +5349,7 @@
         <w:pStyle w:val="FirstParagraph"/>
       </w:pPr>
       <w:r>
-        <w:t xml:space="preserve">The current project objectives are stated in version 7.6 of the SRS [Guilombo Osorio et al. 2026].</w:t>
+        <w:t xml:space="preserve">The current project objectives are stated in version 7.7 of the SRS [Guilombo Osorio et al. 2026].</w:t>
       </w:r>
     </w:p>
     <w:p>
@@ -5619,7 +5645,7 @@
         <w:pStyle w:val="FirstParagraph"/>
       </w:pPr>
       <w:r>
-        <w:t xml:space="preserve">This is an applied technological development work, presented as a single, descriptive case study. The unit of analysis is the system that was built. The evidence comes from the project artifacts: the code of eleven repositories, the design documentation (requirements, fifteen ADRs, data models, OpenAPI contracts), the technical manuals verified against the code, and the test and improvement action records [Patiño Cabrera et al. 2026a; Patiño Cabrera et al. 2026c]. Version 7.6 of the SRS follows the structure of IEEE 830 [IEEE 1998] and the contents of ISO/IEC/IEEE 29148 [ISO/IEC/IEEE 2018], and defines 41 functional requirements, 12 non-functional requirements classified according to the ISO/IEC 25010 quality model [ISO/IEC 2023], 32 use cases, and a traceability matrix with the status of each requirement [Guilombo Osorio et al. 2026].</w:t>
+        <w:t xml:space="preserve">This is an applied technological development work, presented as a single, descriptive case study. The unit of analysis is the system that was built. The evidence comes from the project artifacts: the code of eleven repositories, the design documentation (requirements, fifteen ADRs, data models, OpenAPI contracts), the technical manuals verified against the code, and the test and improvement action records [Patiño Cabrera et al. 2026a; Patiño Cabrera et al. 2026c]. Version 7.7 of the SRS follows the structure of IEEE 830 [IEEE 1998] and the contents of ISO/IEC/IEEE 29148 [ISO/IEC/IEEE 2018], and defines 41 functional requirements, 12 non-functional requirements classified according to the ISO/IEC 25010 quality model [ISO/IEC 2023], 32 use cases, and a traceability matrix with the status of each requirement [Guilombo Osorio et al. 2026].</w:t>
       </w:r>
     </w:p>
     <w:bookmarkEnd w:id="86"/>
@@ -6153,7 +6179,7 @@
         <w:pStyle w:val="FirstParagraph"/>
       </w:pPr>
       <w:r>
-        <w:t xml:space="preserve">The status of the requirements was taken from the SRS traceability matrix, verified against the code on October 16, 2026 [Guilombo Osorio et al. 2026]. The tests were run again on October 19, 2026: the suites of each Java service with the Maven Wrapper, those of payment-service with the .NET SDK (target</w:t>
+        <w:t xml:space="preserve">The status of the requirements was taken from the SRS traceability matrix, verified against the code on October 21, 2026 [Guilombo Osorio et al. 2026]. The tests were run again on October 21, 2026: the suites of each Java service with the Maven Wrapper, those of payment-service with the .NET SDK (target</w:t>
       </w:r>
       <w:r>
         <w:t xml:space="preserve"> </w:t>
@@ -6182,7 +6208,7 @@
         <w:t xml:space="preserve"> </w:t>
       </w:r>
       <w:r>
-        <w:t xml:space="preserve">and the 42 functional cases against the complete system.</w:t>
+        <w:t xml:space="preserve">against the complete system; the 42 functional cases were run on October 19, 2026.</w:t>
       </w:r>
     </w:p>
     <w:bookmarkEnd w:id="91"/>
@@ -6226,7 +6252,7 @@
         <w:t xml:space="preserve"> </w:t>
       </w:r>
       <w:r>
-        <w:t xml:space="preserve">paths to the owning service and does not validate tokens: each service verifies the JWT itself. The five Java services follow the hexagonal architecture (domain, application, and infrastructure, with a domain that does not import Spring or JPA), and the payment service follows a layered architecture in .NET with the same security and error contract [Patiño Cabrera et al. 2026c].</w:t>
+        <w:t xml:space="preserve">paths to the owning service and does not check the token signature: each service verifies the JWT itself. Since October 21, 2026 the gateway does confirm with security-service that the session of the token is still open, so a token stops working when the session is closed. The five Java services follow the hexagonal architecture (domain, application, and infrastructure, with a domain that does not import Spring or JPA), and the payment service follows a layered architecture in .NET with the same security and error contract [Patiño Cabrera et al. 2026c].</w:t>
       </w:r>
     </w:p>
     <w:p>
@@ -7224,7 +7250,7 @@
       <w:r>
         <w:drawing>
           <wp:inline>
-            <wp:extent cx="5334000" cy="996233"/>
+            <wp:extent cx="5334000" cy="1012837"/>
             <wp:effectExtent b="0" l="0" r="0" t="0"/>
             <wp:docPr descr="" title="" id="98" name="Picture"/>
             <a:graphic>
@@ -7245,7 +7271,7 @@
                   <pic:spPr bwMode="auto">
                     <a:xfrm>
                       <a:off x="0" y="0"/>
-                      <a:ext cx="5334000" cy="996233"/>
+                      <a:ext cx="5334000" cy="1012837"/>
                     </a:xfrm>
                     <a:prstGeom prst="rect">
                       <a:avLst/>
@@ -7297,7 +7323,33 @@
         <w:t xml:space="preserve"> </w:t>
       </w:r>
       <w:r>
-        <w:t xml:space="preserve">Gray states are final. Taken from the technical manual [Patiño Cabrera et al. 2026c].</w:t>
+        <w:t xml:space="preserve">Gray states are final.</w:t>
+      </w:r>
+      <w:r>
+        <w:t xml:space="preserve"> </w:t>
+      </w:r>
+      <w:r>
+        <w:rPr>
+          <w:i/>
+          <w:iCs/>
+        </w:rPr>
+        <w:t xml:space="preserve">Expired</w:t>
+      </w:r>
+      <w:r>
+        <w:t xml:space="preserve">: the system cancels a scheduled booking nobody confirmed one hour after its end time;</w:t>
+      </w:r>
+      <w:r>
+        <w:t xml:space="preserve"> </w:t>
+      </w:r>
+      <w:r>
+        <w:rPr>
+          <w:i/>
+          <w:iCs/>
+        </w:rPr>
+        <w:t xml:space="preserve">ended without operator</w:t>
+      </w:r>
+      <w:r>
+        <w:t xml:space="preserve">: in the same time, a confirmed booking that never had an operator becomes NO_SHOW. A confirmed booking with an operator that nobody recorded is closed by the administrator. Taken from the technical manual [Patiño Cabrera et al. 2026c].</w:t>
       </w:r>
     </w:p>
     <w:bookmarkEnd w:id="100"/>
@@ -7315,7 +7367,7 @@
         <w:pStyle w:val="FirstParagraph"/>
       </w:pPr>
       <w:r>
-        <w:t xml:space="preserve">The SRS defines 41 functional requirements: the original 29 (RF-001 to RF-026, with RF-004b, RF-012b, and RF-013b), 9 added in version 4.0 because they described functions already built (RF-027 to RF-035), and 3 from version 6.0 (RF-036 to RF-038: inspection report, business data, and operator profile). Table 4 summarizes their status as of October 16, 2026: 40 implemented (98%) and 1 partial.</w:t>
+        <w:t xml:space="preserve">The SRS defines 41 functional requirements: the original 29 (RF-001 to RF-026, with RF-004b, RF-012b, and RF-013b), 9 added in version 4.0 because they described functions already built (RF-027 to RF-035), and 3 from version 6.0 (RF-036 to RF-038: inspection report, business data, and operator profile). Table 4 summarizes their status as of October 21, 2026: 40 implemented (98%) and 1 partial.</w:t>
       </w:r>
     </w:p>
     <w:p>
@@ -7333,7 +7385,7 @@
         <w:t xml:space="preserve"> </w:t>
       </w:r>
       <w:r>
-        <w:t xml:space="preserve">Status of the Functional Requirements as of October 16, 2026</w:t>
+        <w:t xml:space="preserve">Status of the Functional Requirements as of October 21, 2026</w:t>
       </w:r>
     </w:p>
     <w:tbl>
@@ -7505,7 +7557,7 @@
         <w:t xml:space="preserve"> </w:t>
       </w:r>
       <w:r>
-        <w:t xml:space="preserve">Based on the traceability matrix of the SRS, version 7.6 [Guilombo Osorio et al. 2026].</w:t>
+        <w:t xml:space="preserve">Based on the traceability matrix of the SRS, version 7.7 [Guilombo Osorio et al. 2026].</w:t>
       </w:r>
     </w:p>
     <w:p>
@@ -7521,7 +7573,7 @@
         <w:pStyle w:val="BodyText"/>
       </w:pPr>
       <w:r>
-        <w:t xml:space="preserve">Of the 12 non-functional requirements, 5 are implemented and 7 are partial [Guilombo Osorio et al. 2026]. The implemented ones are response time (the highest 95th percentile, measured on October 14, 2026, was 686 ms against a 2-second target), availability during the review sessions, security, event idempotency, and tolerance to failures of external services. The partial ones are integrity and concurrency (integration tests against SQL Server are missing), observability, maintainability, portability, compatibility (web screens do not overflow 360 px, but testing on an Android 8 device is missing), usability (no test with users), and localization.</w:t>
+        <w:t xml:space="preserve">Of the 12 non-functional requirements, 5 are implemented and 7 are partial [Guilombo Osorio et al. 2026]. The implemented ones are response time (the highest 95th percentile, measured on October 14, 2026, was 686 ms against a 2-second target), availability during the review sessions, security, event idempotency, and tolerance to failures of external services. The partial ones are integrity and concurrency (bookings and assignments are already made one at a time with database locks, but integration tests against SQL Server are missing), observability, maintainability, portability, compatibility (web screens do not overflow 360 px, but testing on an Android 8 device is missing), usability (no test with users), and localization.</w:t>
       </w:r>
     </w:p>
     <w:bookmarkEnd w:id="101"/>
@@ -7539,7 +7591,7 @@
         <w:pStyle w:val="FirstParagraph"/>
       </w:pPr>
       <w:r>
-        <w:t xml:space="preserve">On October 19, 2026, all the automated suites were run: 655 tests passed, none failed or skipped; the 7 payment-service persistence tests ran against an isolated test database (Table 5). That same day the 19 end-to-end tests of</w:t>
+        <w:t xml:space="preserve">On the night of October 21, 2026, all the automated suites were run: 707 tests passed, none failed or skipped; the 7 payment-service persistence tests ran against an isolated test database (Table 5). That same day the 19 end-to-end tests of</w:t>
       </w:r>
       <w:r>
         <w:t xml:space="preserve"> </w:t>
@@ -7555,7 +7607,7 @@
         <w:t xml:space="preserve"> </w:t>
       </w:r>
       <w:r>
-        <w:t xml:space="preserve">passed; they run through the complete system: booking with operator choice and automatic assignment, the flow of the three roles with payment, approval, points, execution, and rating, the inspection report with photos and a public link, and access rules per role. The SRS recorded 347 tests on October 6 [Guilombo Osorio et al. 2026]; the difference corresponds to the tests added with each new function.</w:t>
+        <w:t xml:space="preserve">passed; they run through the complete system: booking with operator choice and automatic assignment, the flow of the three roles with payment, approval, points, execution, and rating, the inspection report with photos and a public link, and access rules per role, with the gateway session check on. The SRS recorded 347 tests on October 6 [Guilombo Osorio et al. 2026]; the difference corresponds to the tests added with each new function.</w:t>
       </w:r>
     </w:p>
     <w:p>
@@ -7573,7 +7625,7 @@
         <w:t xml:space="preserve"> </w:t>
       </w:r>
       <w:r>
-        <w:t xml:space="preserve">Results of the Automated Test Run (October 19, 2026)</w:t>
+        <w:t xml:space="preserve">Results of the Automated Test Run (October 21, 2026)</w:t>
       </w:r>
     </w:p>
     <w:tbl>
@@ -7668,18 +7720,18 @@
               <w:pStyle w:val="Compact"/>
             </w:pPr>
             <w:r>
-              <w:t xml:space="preserve">43</w:t>
-            </w:r>
-          </w:p>
-        </w:tc>
-        <w:tc>
-          <w:tcPr/>
-          <w:p>
-            <w:pPr>
-              <w:pStyle w:val="Compact"/>
-            </w:pPr>
-            <w:r>
-              <w:t xml:space="preserve">43</w:t>
+              <w:t xml:space="preserve">62</w:t>
+            </w:r>
+          </w:p>
+        </w:tc>
+        <w:tc>
+          <w:tcPr/>
+          <w:p>
+            <w:pPr>
+              <w:pStyle w:val="Compact"/>
+            </w:pPr>
+            <w:r>
+              <w:t xml:space="preserve">62</w:t>
             </w:r>
           </w:p>
         </w:tc>
@@ -7725,18 +7777,18 @@
               <w:pStyle w:val="Compact"/>
             </w:pPr>
             <w:r>
-              <w:t xml:space="preserve">34</w:t>
-            </w:r>
-          </w:p>
-        </w:tc>
-        <w:tc>
-          <w:tcPr/>
-          <w:p>
-            <w:pPr>
-              <w:pStyle w:val="Compact"/>
-            </w:pPr>
-            <w:r>
-              <w:t xml:space="preserve">34</w:t>
+              <w:t xml:space="preserve">40</w:t>
+            </w:r>
+          </w:p>
+        </w:tc>
+        <w:tc>
+          <w:tcPr/>
+          <w:p>
+            <w:pPr>
+              <w:pStyle w:val="Compact"/>
+            </w:pPr>
+            <w:r>
+              <w:t xml:space="preserve">40</w:t>
             </w:r>
           </w:p>
         </w:tc>
@@ -7782,18 +7834,18 @@
               <w:pStyle w:val="Compact"/>
             </w:pPr>
             <w:r>
-              <w:t xml:space="preserve">151</w:t>
-            </w:r>
-          </w:p>
-        </w:tc>
-        <w:tc>
-          <w:tcPr/>
-          <w:p>
-            <w:pPr>
-              <w:pStyle w:val="Compact"/>
-            </w:pPr>
-            <w:r>
-              <w:t xml:space="preserve">151</w:t>
+              <w:t xml:space="preserve">155</w:t>
+            </w:r>
+          </w:p>
+        </w:tc>
+        <w:tc>
+          <w:tcPr/>
+          <w:p>
+            <w:pPr>
+              <w:pStyle w:val="Compact"/>
+            </w:pPr>
+            <w:r>
+              <w:t xml:space="preserve">155</w:t>
             </w:r>
           </w:p>
         </w:tc>
@@ -7896,18 +7948,18 @@
               <w:pStyle w:val="Compact"/>
             </w:pPr>
             <w:r>
-              <w:t xml:space="preserve">43</w:t>
-            </w:r>
-          </w:p>
-        </w:tc>
-        <w:tc>
-          <w:tcPr/>
-          <w:p>
-            <w:pPr>
-              <w:pStyle w:val="Compact"/>
-            </w:pPr>
-            <w:r>
-              <w:t xml:space="preserve">43</w:t>
+              <w:t xml:space="preserve">50</w:t>
+            </w:r>
+          </w:p>
+        </w:tc>
+        <w:tc>
+          <w:tcPr/>
+          <w:p>
+            <w:pPr>
+              <w:pStyle w:val="Compact"/>
+            </w:pPr>
+            <w:r>
+              <w:t xml:space="preserve">50</w:t>
             </w:r>
           </w:p>
         </w:tc>
@@ -7953,18 +8005,18 @@
               <w:pStyle w:val="Compact"/>
             </w:pPr>
             <w:r>
-              <w:t xml:space="preserve">55</w:t>
-            </w:r>
-          </w:p>
-        </w:tc>
-        <w:tc>
-          <w:tcPr/>
-          <w:p>
-            <w:pPr>
-              <w:pStyle w:val="Compact"/>
-            </w:pPr>
-            <w:r>
-              <w:t xml:space="preserve">55</w:t>
+              <w:t xml:space="preserve">67</w:t>
+            </w:r>
+          </w:p>
+        </w:tc>
+        <w:tc>
+          <w:tcPr/>
+          <w:p>
+            <w:pPr>
+              <w:pStyle w:val="Compact"/>
+            </w:pPr>
+            <w:r>
+              <w:t xml:space="preserve">67</w:t>
             </w:r>
           </w:p>
         </w:tc>
@@ -8010,18 +8062,18 @@
               <w:pStyle w:val="Compact"/>
             </w:pPr>
             <w:r>
-              <w:t xml:space="preserve">112</w:t>
-            </w:r>
-          </w:p>
-        </w:tc>
-        <w:tc>
-          <w:tcPr/>
-          <w:p>
-            <w:pPr>
-              <w:pStyle w:val="Compact"/>
-            </w:pPr>
-            <w:r>
-              <w:t xml:space="preserve">112</w:t>
+              <w:t xml:space="preserve">114</w:t>
+            </w:r>
+          </w:p>
+        </w:tc>
+        <w:tc>
+          <w:tcPr/>
+          <w:p>
+            <w:pPr>
+              <w:pStyle w:val="Compact"/>
+            </w:pPr>
+            <w:r>
+              <w:t xml:space="preserve">114</w:t>
             </w:r>
           </w:p>
         </w:tc>
@@ -8067,18 +8119,18 @@
               <w:pStyle w:val="Compact"/>
             </w:pPr>
             <w:r>
-              <w:t xml:space="preserve">148</w:t>
-            </w:r>
-          </w:p>
-        </w:tc>
-        <w:tc>
-          <w:tcPr/>
-          <w:p>
-            <w:pPr>
-              <w:pStyle w:val="Compact"/>
-            </w:pPr>
-            <w:r>
-              <w:t xml:space="preserve">148</w:t>
+              <w:t xml:space="preserve">150</w:t>
+            </w:r>
+          </w:p>
+        </w:tc>
+        <w:tc>
+          <w:tcPr/>
+          <w:p>
+            <w:pPr>
+              <w:pStyle w:val="Compact"/>
+            </w:pPr>
+            <w:r>
+              <w:t xml:space="preserve">150</w:t>
             </w:r>
           </w:p>
         </w:tc>
@@ -8132,7 +8184,7 @@
                 <w:b/>
                 <w:bCs/>
               </w:rPr>
-              <w:t xml:space="preserve">655</w:t>
+              <w:t xml:space="preserve">707</w:t>
             </w:r>
           </w:p>
         </w:tc>
@@ -8147,7 +8199,7 @@
                 <w:b/>
                 <w:bCs/>
               </w:rPr>
-              <w:t xml:space="preserve">655</w:t>
+              <w:t xml:space="preserve">707</w:t>
             </w:r>
           </w:p>
         </w:tc>
@@ -8540,7 +8592,7 @@
         <w:pStyle w:val="FirstParagraph"/>
       </w:pPr>
       <w:r>
-        <w:t xml:space="preserve">As of October 16, 2026, the actions register contained 39 closed corrective actions, 2 open corrective actions, 14 preventive actions, and 13 improvement actions, 5 of which are already closed [Patiño Cabrera et al. 2026a]. The corrective closure indicator rose from 64% on October 9 to 95% (39 of 41), above the 70% target, and recurrence was 0%. No open corrective actions of P0 or P1 severity remain: account lockout (AC-25) and consent recording (AC-26) were closed with tests. The closed corrections include high-impact defects, such as booking times shifted by five hours due to time zone handling (AC-01), the possibility of paying two bookings with the same transaction reference (AC-07), a points ledger with no reversal or concurrency control (AC-09), and two simultaneous requests that tried to create the same operator (AC-35).</w:t>
+        <w:t xml:space="preserve">As of October 21, 2026, the actions register contained 52 closed corrective actions, 3 open corrective actions, 18 preventive actions, and 16 improvement actions, 8 of which are already closed [Patiño Cabrera et al. 2026a]. The corrective closure indicator rose from 64% on October 9 to 95% (52 of 55), above the 70% target, and recurrence was 0%. No open corrective actions of P0 or P1 severity remain: account lockout (AC-25) and consent recording (AC-26) were closed with tests. The closed corrections include high-impact defects, such as booking times shifted by five hours due to time zone handling (AC-01), the possibility of paying two bookings with the same transaction reference (AC-07), a points ledger with no reversal or concurrency control (AC-09), two simultaneous requests that tried to create the same operator (AC-35), and a token that kept working up to an hour after logout (AC-44).</w:t>
       </w:r>
     </w:p>
     <w:p>
@@ -8938,15 +8990,15 @@
         <w:pStyle w:val="BodyText"/>
       </w:pPr>
       <w:r>
-        <w:t xml:space="preserve">Enforcing the critical rules in the database, and not only in code, proved appropriate for a domain with concurrency: two customers booking the same bay or two administrators approving the same payment do not depend on the application code being correct on every path. The payment-service persistence tests that cover these cases exist, but they need a dedicated test database; the end-to-end suite does exercise those rules against the real SQL Server of the Docker environment.</w:t>
-      </w:r>
-    </w:p>
-    <w:p>
-      <w:pPr>
-        <w:pStyle w:val="BodyText"/>
-      </w:pPr>
-      <w:r>
-        <w:t xml:space="preserve">The application of hexagonal architecture [Cockburn 2005] is reflected in the shape of the tests: 648 of the 655 automated tests run without a database, because they test the domain, the use cases, and the web layer with test doubles instead of the real infrastructure, which makes them fast and deterministic. Since October 19, 2026, these tests run automatically on every change with GitHub Actions; however, the lack of coverage measurement limits the confidence these figures can provide, and the end-to-end suite, which tests the integrated services, is still run by hand. Research by Forsgren et al. [2018] associates continuous integration and test automation with better software delivery performance, which is why the project closed its technical debt TD-006 with GitHub Actions.</w:t>
+        <w:t xml:space="preserve">Enforcing the critical rules in the database, and not only in code, proved appropriate for a domain with concurrency: two customers booking the same bay or two administrators approving the same payment do not depend on the application code being correct on every path. With the same criterion, since October 21, 2026 the manual and the automatic assignment of an operator are made one at a time with a SQL Server lock. The team review also found a risk in the first version of the automatic close of bookings, from the same day: it marked as No-show every confirmed booking nobody started, so a service done but not recorded would have appeared as a customer absence in the history and the reports. The design was changed so that the system decides on its own only when it is sure (a booking that never had an operator) and leaves the rest to the administrator in a list of bookings to close. The payment-service persistence tests that cover these cases exist, but they need a dedicated test database; the end-to-end suite does exercise those rules against the real SQL Server of the Docker environment.</w:t>
+      </w:r>
+    </w:p>
+    <w:p>
+      <w:pPr>
+        <w:pStyle w:val="BodyText"/>
+      </w:pPr>
+      <w:r>
+        <w:t xml:space="preserve">The application of hexagonal architecture [Cockburn 2005] is reflected in the shape of the tests: 700 of the 707 automated tests run without a database, because they test the domain, the use cases, and the web layer with test doubles instead of the real infrastructure, which makes them fast and deterministic. Since October 19, 2026, these tests run automatically on every change with GitHub Actions; however, the lack of coverage measurement limits the confidence these figures can provide, and the end-to-end suite, which tests the integrated services, is still run by hand. Research by Forsgren et al. [2018] associates continuous integration and test automation with better software delivery performance, which is why the project closed its technical debt TD-006 with GitHub Actions.</w:t>
       </w:r>
     </w:p>
     <w:p>
@@ -8971,7 +9023,7 @@
         <w:pStyle w:val="FirstParagraph"/>
       </w:pPr>
       <w:r>
-        <w:t xml:space="preserve">This work has important limitations. First, there is no evidence from users: the problem is a documented hypothesis, the acceptance cases were not run, and there was no pilot, so it cannot be claimed that the system reduces conflicts, wasted trips, or management time. Second, the public server is a single virtual machine that is turned on on demand, without high availability or a separate test environment. Third, automated verification does not include measured coverage or persistence tests of the Java services against the real database outside the end-to-end suite. Fourth, security improvements remain open, such as a request rate limit in the gateway, populated auditing, and one database login per service. Fifth, the SRS leaves business and compliance decisions open: whether payment must be approved before the service starts, the actual enforcement of the permissions matrix, and a policy for retaining and deleting personal data [Guilombo Osorio et al. 2026]. Sixth, the case is single and small-scale, so its conclusions cannot be generalized to other businesses.</w:t>
+        <w:t xml:space="preserve">This work has important limitations. First, there is no evidence from users: the problem is a documented hypothesis, the acceptance cases were not run, and there was no pilot, so it cannot be claimed that the system reduces conflicts, wasted trips, or management time. Second, the public server is a single virtual machine that is turned on on demand, without high availability or a separate test environment; since October 21, 2026 the database is backed up and checked every day, but the copies stay on the same disk. Third, automated verification does not include measured coverage or persistence tests of the Java services against the real database outside the end-to-end suite. Fourth, security improvements remain open, such as a request rate limit in the gateway, populated auditing, and one database login per service. Fifth, the SRS leaves business and compliance decisions open: whether payment must be approved before the service starts, the actual enforcement of the permissions matrix, and a policy for retaining and deleting personal data [Guilombo Osorio et al. 2026]. Sixth, the case is single and small-scale, so its conclusions cannot be generalized to other businesses.</w:t>
       </w:r>
     </w:p>
     <w:bookmarkEnd w:id="108"/>
@@ -8998,7 +9050,7 @@
         <w:pStyle w:val="BodyText"/>
       </w:pPr>
       <w:r>
-        <w:t xml:space="preserve">The verified status is favorable on the technical side: 40 of 41 functional requirements implemented, 655 automated tests, 19 end-to-end tests, and 42 functional cases passing with no failures, and the system deployed on a public server with HTTPS. The critical business rules are enforced in the database, which protects the system against concurrency in bookings, payments, and points.</w:t>
+        <w:t xml:space="preserve">The verified status is favorable on the technical side: 40 of 41 functional requirements implemented, 707 automated tests, 19 end-to-end tests, and 42 functional cases passing with no failures, and the system deployed on a public server with HTTPS. The critical business rules are enforced in the database, which protects the system against concurrency in bookings, assignments, payments, and points.</w:t>
       </w:r>
     </w:p>
     <w:p>
@@ -9197,7 +9249,7 @@
         <w:t xml:space="preserve"> </w:t>
       </w:r>
       <w:r>
-        <w:t xml:space="preserve">[Software requirements specification (SRS) of the LavaRápido system: Web and mobile booking and management platform for a car wash] (Version 7.6). Unpublished document. Servicio Nacional de Aprendizaje.</w:t>
+        <w:t xml:space="preserve">[Software requirements specification (SRS) of the LavaRápido system: Web and mobile booking and management platform for a car wash] (Version 7.7). Unpublished document. Servicio Nacional de Aprendizaje.</w:t>
       </w:r>
     </w:p>
     <w:p>
@@ -9597,7 +9649,7 @@
         <w:t xml:space="preserve"> </w:t>
       </w:r>
       <w:r>
-        <w:t xml:space="preserve">(Version 2.0). Unpublished document. Servicio Nacional de Aprendizaje.</w:t>
+        <w:t xml:space="preserve">(Version 2.5). Unpublished document. Servicio Nacional de Aprendizaje.</w:t>
       </w:r>
     </w:p>
     <w:p>
@@ -9621,7 +9673,7 @@
         <w:t xml:space="preserve"> </w:t>
       </w:r>
       <w:r>
-        <w:t xml:space="preserve">(Version 2.0). Unpublished document. Servicio Nacional de Aprendizaje.</w:t>
+        <w:t xml:space="preserve">(Version 2.4). Unpublished document. Servicio Nacional de Aprendizaje.</w:t>
       </w:r>
     </w:p>
     <w:p>
@@ -9645,7 +9697,7 @@
         <w:t xml:space="preserve"> </w:t>
       </w:r>
       <w:r>
-        <w:t xml:space="preserve">(Version 4.0). Unpublished document. Servicio Nacional de Aprendizaje.</w:t>
+        <w:t xml:space="preserve">(Version 4.5). Unpublished document. Servicio Nacional de Aprendizaje.</w:t>
       </w:r>
     </w:p>
     <w:p>

</xml_diff>